<commit_message>
Align demo with protected deal flow
Update the demo and supporting documentation for bank-signed deal QR codes, category-based risk warnings, buyer-controlled shipment checks, dispute reporting, authority evidence packs, and authority-ordered refunds. Add the consolidated system design and related pitch materials.
</commit_message>
<xml_diff>
--- a/EsKrow+_Legal_Feasibility.docx
+++ b/EsKrow+_Legal_Feasibility.docx
@@ -18,7 +18,7 @@
         <w:rPr>
           <w:color w:val="555555"/>
         </w:rPr>
-        <w:t xml:space="preserve">Can a Thai bank hold buyer funds in escrow? · 21 October 2026 · Team EsKrow+</w:t>
+        <w:t xml:space="preserve">Can a Thai bank hold buyer funds in escrow? · 29 October 2026 · Team EsKrow+</w:t>
       </w:r>
     </w:p>
     <w:p>
@@ -97,7 +97,7 @@
         <w:spacing w:after="100"/>
       </w:pPr>
       <w:r>
-        <w:t xml:space="preserve">KBank still needs Ministry of Finance permission and must notify the BOT before launch. Both sides of every deal must sign an escrow contract with the bank.</w:t>
+        <w:t xml:space="preserve">KBank still needs Ministry of Finance permission and must notify the BOT before launch. Every deal that goes through escrow (rated yellow or red; green deals are paid directly) needs an escrow contract signed by both sides and the bank.</w:t>
       </w:r>
     </w:p>
     <w:p>
@@ -1052,7 +1052,7 @@
                 <w:sz w:val="18"/>
                 <w:szCs w:val="18"/>
               </w:rPr>
-              <w:t xml:space="preserve">CREATE DEAL: both agree price and terms</w:t>
+              <w:t xml:space="preserve">Seller creates the deal (item, price, buyer, shipping address); both accept, the buyer by face scan or PIN</w:t>
             </w:r>
           </w:p>
         </w:tc>
@@ -1078,7 +1078,7 @@
                 <w:sz w:val="18"/>
                 <w:szCs w:val="18"/>
               </w:rPr>
-              <w:t xml:space="preserve">Seller e-signs in K PLUS; confirm e-signature satisfies </w:t>
+              <w:t xml:space="preserve">Both sides e-sign in K PLUS; confirm e-signature satisfies </w:t>
             </w:r>
             <w:r>
               <w:rPr>
@@ -1251,7 +1251,7 @@
                 <w:sz w:val="18"/>
                 <w:szCs w:val="18"/>
               </w:rPr>
-              <w:t xml:space="preserve">Policy-Based Authorization; VERIFY TRACKING</w:t>
+              <w:t xml:space="preserve">Policy-Based Authorization; the buyer checks the shipment ID and confirms</w:t>
             </w:r>
           </w:p>
         </w:tc>
@@ -1837,7 +1837,7 @@
                 <w:sz w:val="18"/>
                 <w:szCs w:val="18"/>
               </w:rPr>
-              <w:t xml:space="preserve">Write the release, refund and buyer-report rules into the contract (proposed wording below)</w:t>
+              <w:t xml:space="preserve">Write the release, expiry, buyer-report and no-agreement rules into the contract (proposed wording below)</w:t>
             </w:r>
           </w:p>
         </w:tc>
@@ -2478,7 +2478,7 @@
         <w:spacing w:after="100"/>
       </w:pPr>
       <w:r>
-        <w:t xml:space="preserve">The buyer releases the money; the bank checks the shipment first. Every outcome follows a rule both sides signed (</w:t>
+        <w:t xml:space="preserve">The buyer releases the money after checking the shipment herself; the bank does not verify tracking numbers. Only deals rated yellow or red go through escrow, while green deals are paid to the seller directly. Every outcome follows a rule both sides signed (</w:t>
       </w:r>
       <w:r>
         <w:rPr>
@@ -2551,7 +2551,7 @@
         <w:spacing w:after="60"/>
       </w:pPr>
       <w:r>
-        <w:t xml:space="preserve">Within 72 hours of payment, the seller enters a shipment ID (tracking number) in K PLUS. Screenshots are not accepted.</w:t>
+        <w:t xml:space="preserve">Within 72 hours of payment, the seller ships the goods and enters the carrier's shipment ID in K PLUS. The bank passes it to the buyer as entered and does not check it with the carrier.</w:t>
       </w:r>
     </w:p>
     <w:p>
@@ -2564,7 +2564,7 @@
         <w:spacing w:after="60"/>
       </w:pPr>
       <w:r>
-        <w:t xml:space="preserve">The bank checks the ID with the carrier: it exists, was created after the deal, goes to the buyer's address and name, and is not used in another deal. If it fails, the seller is told at once and can send another ID before the deadline.</w:t>
+        <w:t xml:space="preserve">The app notifies the buyer, who looks the ID up with the carrier and compares it with the address and recipient in the contract. One tap confirms, and the money is paid to the seller.</w:t>
       </w:r>
     </w:p>
     <w:p>
@@ -2577,7 +2577,7 @@
         <w:spacing w:after="60"/>
       </w:pPr>
       <w:r>
-        <w:t xml:space="preserve">A verified ID goes to the buyer, who sees the carrier's own address and recipient. One tap confirms, and the money is paid to the seller.</w:t>
+        <w:t xml:space="preserve">If the buyer neither confirms nor reports within 48 hours of receiving the ID, the money is paid to the seller.</w:t>
       </w:r>
     </w:p>
     <w:p>
@@ -2590,7 +2590,7 @@
         <w:spacing w:after="60"/>
       </w:pPr>
       <w:r>
-        <w:t xml:space="preserve">If the buyer neither confirms nor reports within 48 hours of a verified ID, the money is paid to the seller.</w:t>
+        <w:t xml:space="preserve">If no shipment ID arrives within 72 hours, the contract expires and the money is refunded to the buyer's paying account.</w:t>
       </w:r>
     </w:p>
     <w:p>
@@ -2603,7 +2603,7 @@
         <w:spacing w:after="60"/>
       </w:pPr>
       <w:r>
-        <w:t xml:space="preserve">If the buyer reports a problem before payment, the money stays held and the carrier's records decide.</w:t>
+        <w:t xml:space="preserve">If the buyer reports a problem before payment, with a reason and a photo, the money stays held. The two sides can settle in the app: cancel, partial refund or reship.</w:t>
       </w:r>
     </w:p>
     <w:p>
@@ -2616,7 +2616,7 @@
         <w:spacing w:after="60"/>
       </w:pPr>
       <w:r>
-        <w:t xml:space="preserve">If no verified ID arrives within 72 hours, the money is refunded to the buyer's paying account.</w:t>
+        <w:t xml:space="preserve">If they can't agree, the bank sends an Evidence Pack to AOC 1441 / police. The money stays held, for up to about 7 days for an authority order, then frozen until the parties agree or a court rules.</w:t>
       </w:r>
     </w:p>
     <w:p>
@@ -2624,7 +2624,7 @@
         <w:spacing w:before="100" w:after="100"/>
       </w:pPr>
       <w:r>
-        <w:t xml:space="preserve">The buyer's tap is the parties agreeing, which </w:t>
+        <w:t xml:space="preserve">The buyer's tap, and any settlement, is the parties agreeing, which </w:t>
       </w:r>
       <w:r>
         <w:rPr>
@@ -2648,7 +2648,7 @@
         <w:t xml:space="preserve">๒๓</w:t>
       </w:r>
       <w:r>
-        <w:t xml:space="preserve"> recognises. For every other case the contract sets the rule, which </w:t>
+        <w:t xml:space="preserve"> recognises. For silence and for a missing shipment ID the contract sets the rule, which </w:t>
       </w:r>
       <w:r>
         <w:rPr>
@@ -2672,7 +2672,31 @@
         <w:t xml:space="preserve">๒๓</w:t>
       </w:r>
       <w:r>
-        <w:t xml:space="preserve"> allows (“unless otherwise stipulated”). Without these rules, a seller who just says “I did ship” would freeze the money until a court rules.</w:t>
+        <w:t xml:space="preserve"> allows (“unless otherwise stipulated”). A reported deal with no agreement falls back to </w:t>
+      </w:r>
+      <w:r>
+        <w:rPr>
+          <w:rFonts w:ascii="Leelawadee UI" w:hAnsi="Leelawadee UI" w:cs="Leelawadee UI" w:eastAsia="Leelawadee UI"/>
+          <w:sz w:val="22"/>
+          <w:szCs w:val="22"/>
+          <w:lang w:val="th-TH" w:bidi="th-TH"/>
+        </w:rPr>
+        <w:t xml:space="preserve">ม</w:t>
+      </w:r>
+      <w:r>
+        <w:t xml:space="preserve">.</w:t>
+      </w:r>
+      <w:r>
+        <w:rPr>
+          <w:rFonts w:ascii="Leelawadee UI" w:hAnsi="Leelawadee UI" w:cs="Leelawadee UI" w:eastAsia="Leelawadee UI"/>
+          <w:sz w:val="22"/>
+          <w:szCs w:val="22"/>
+          <w:lang w:val="th-TH" w:bidi="th-TH"/>
+        </w:rPr>
+        <w:t xml:space="preserve">๒๓</w:t>
+      </w:r>
+      <w:r>
+        <w:t xml:space="preserve"> itself: the money stays frozen. The bank never decides who is right.</w:t>
       </w:r>
     </w:p>
     <w:p>
@@ -2708,7 +2732,7 @@
         <w:t xml:space="preserve">Release.</w:t>
       </w:r>
       <w:r>
-        <w:t xml:space="preserve"> The escrow money is paid to the seller when the buyer confirms a shipment ID the bank has verified with the carrier, or 48 hours after the bank sends a verified shipment ID to the buyer if the buyer neither confirms nor reports a problem.</w:t>
+        <w:t xml:space="preserve"> The escrow money is paid to the seller when the buyer confirms the shipment in the app, or 48 hours after the seller's shipment ID is sent to the buyer if the buyer neither confirms nor reports a problem.</w:t>
       </w:r>
     </w:p>
     <w:p>
@@ -2725,10 +2749,10 @@
           <w:b/>
           <w:bCs/>
         </w:rPr>
-        <w:t xml:space="preserve">Refund.</w:t>
-      </w:r>
-      <w:r>
-        <w:t xml:space="preserve"> If no shipment ID passes verification within 72 hours of payment, the escrow money is returned to the buyer's paying account.</w:t>
+        <w:t xml:space="preserve">Expiry and refund.</w:t>
+      </w:r>
+      <w:r>
+        <w:t xml:space="preserve"> If the seller does not enter a shipment ID within 72 hours of payment, this contract expires and the escrow money is returned to the buyer's paying account.</w:t>
       </w:r>
     </w:p>
     <w:p>
@@ -2748,7 +2772,7 @@
         <w:t xml:space="preserve">Buyer report.</w:t>
       </w:r>
       <w:r>
-        <w:t xml:space="preserve"> If the buyer reports a problem before release, the money stays held and the carrier's records decide whether it is released or refunded.</w:t>
+        <w:t xml:space="preserve"> If the buyer reports a problem before release, giving a reason and supporting evidence, the money stays held. The parties may agree to cancel, partially refund or reship, and the bank pays out as agreed.</w:t>
       </w:r>
     </w:p>
     <w:p>
@@ -2765,34 +2789,10 @@
           <w:b/>
           <w:bCs/>
         </w:rPr>
-        <w:t xml:space="preserve">Other disputes.</w:t>
-      </w:r>
-      <w:r>
-        <w:t xml:space="preserve"> Any other dispute freezes the money under </w:t>
-      </w:r>
-      <w:r>
-        <w:rPr>
-          <w:rFonts w:ascii="Leelawadee UI" w:hAnsi="Leelawadee UI" w:cs="Leelawadee UI" w:eastAsia="Leelawadee UI"/>
-          <w:sz w:val="22"/>
-          <w:szCs w:val="22"/>
-          <w:lang w:val="th-TH" w:bidi="th-TH"/>
-        </w:rPr>
-        <w:t xml:space="preserve">ม</w:t>
-      </w:r>
-      <w:r>
-        <w:t xml:space="preserve">.</w:t>
-      </w:r>
-      <w:r>
-        <w:rPr>
-          <w:rFonts w:ascii="Leelawadee UI" w:hAnsi="Leelawadee UI" w:cs="Leelawadee UI" w:eastAsia="Leelawadee UI"/>
-          <w:sz w:val="22"/>
-          <w:szCs w:val="22"/>
-          <w:lang w:val="th-TH" w:bidi="th-TH"/>
-        </w:rPr>
-        <w:t xml:space="preserve">๒๓</w:t>
-      </w:r>
-      <w:r>
-        <w:t xml:space="preserve"> until both sides agree or a court rules.</w:t>
+        <w:t xml:space="preserve">No agreement.</w:t>
+      </w:r>
+      <w:r>
+        <w:t xml:space="preserve"> If the parties do not agree, the bank may send the deal records to the competent authorities, and the money stays held until the parties agree, a competent authority orders otherwise, or a court rules.</w:t>
       </w:r>
     </w:p>
     <w:tbl>
@@ -2932,7 +2932,7 @@
                 <w:sz w:val="18"/>
                 <w:szCs w:val="18"/>
               </w:rPr>
-              <w:t xml:space="preserve">Seller says “I did ship” to block the refund</w:t>
+              <w:t xml:space="preserve">Seller says “I did ship” but never enters an ID</w:t>
             </w:r>
           </w:p>
         </w:tc>
@@ -3009,7 +3009,7 @@
                 <w:sz w:val="18"/>
                 <w:szCs w:val="18"/>
               </w:rPr>
-              <w:t xml:space="preserve">Only a carrier-verified shipment ID counts. The seller is told when an ID fails and has until the deadline to send a valid one</w:t>
+              <w:t xml:space="preserve">Only a shipment ID entered within 72 hours counts. No ID means the contract expires and the buyer is refunded</w:t>
             </w:r>
           </w:p>
         </w:tc>
@@ -3041,7 +3041,7 @@
                 <w:sz w:val="18"/>
                 <w:szCs w:val="18"/>
               </w:rPr>
-              <w:t xml:space="preserve">Buyer stays silent to hold up payment</w:t>
+              <w:t xml:space="preserve">Seller enters a fake or someone else's tracking number</w:t>
             </w:r>
           </w:p>
         </w:tc>
@@ -3134,7 +3134,7 @@
                 <w:sz w:val="18"/>
                 <w:szCs w:val="18"/>
               </w:rPr>
-              <w:t xml:space="preserve">Paid to the seller 48 hours after a verified ID</w:t>
+              <w:t xml:space="preserve">The buyer compares it with the contract before confirming and can report. The money stays held, and the Evidence Pack goes to AOC 1441 / police</w:t>
             </w:r>
           </w:p>
         </w:tc>
@@ -3166,7 +3166,7 @@
                 <w:sz w:val="18"/>
                 <w:szCs w:val="18"/>
               </w:rPr>
-              <w:t xml:space="preserve">Buyer reports a correct shipment to stall payment</w:t>
+              <w:t xml:space="preserve">Buyer stays silent to hold up payment</w:t>
             </w:r>
           </w:p>
         </w:tc>
@@ -3233,39 +3233,7 @@
                 <w:sz w:val="18"/>
                 <w:szCs w:val="18"/>
               </w:rPr>
-              <w:t xml:space="preserve">) and </w:t>
-            </w:r>
-            <w:r>
-              <w:rPr>
-                <w:rFonts w:ascii="Leelawadee UI" w:hAnsi="Leelawadee UI" w:cs="Leelawadee UI" w:eastAsia="Leelawadee UI"/>
-                <w:sz w:val="20"/>
-                <w:szCs w:val="20"/>
-                <w:lang w:val="th-TH" w:bidi="th-TH"/>
-              </w:rPr>
-              <w:t xml:space="preserve">ม</w:t>
-            </w:r>
-            <w:r>
-              <w:rPr>
-                <w:sz w:val="18"/>
-                <w:szCs w:val="18"/>
-              </w:rPr>
-              <w:t xml:space="preserve">.</w:t>
-            </w:r>
-            <w:r>
-              <w:rPr>
-                <w:rFonts w:ascii="Leelawadee UI" w:hAnsi="Leelawadee UI" w:cs="Leelawadee UI" w:eastAsia="Leelawadee UI"/>
-                <w:sz w:val="20"/>
-                <w:szCs w:val="20"/>
-                <w:lang w:val="th-TH" w:bidi="th-TH"/>
-              </w:rPr>
-              <w:t xml:space="preserve">๒๓</w:t>
-            </w:r>
-            <w:r>
-              <w:rPr>
-                <w:sz w:val="18"/>
-                <w:szCs w:val="18"/>
-              </w:rPr>
-              <w:t xml:space="preserve">, as above</w:t>
+              <w:t xml:space="preserve">), as above</w:t>
             </w:r>
           </w:p>
         </w:tc>
@@ -3291,7 +3259,7 @@
                 <w:sz w:val="18"/>
                 <w:szCs w:val="18"/>
               </w:rPr>
-              <w:t xml:space="preserve">Carrier records decide; if they match the deal, the money is released</w:t>
+              <w:t xml:space="preserve">Paid to the seller 48 hours after the shipment ID is sent</w:t>
             </w:r>
           </w:p>
         </w:tc>
@@ -3323,7 +3291,7 @@
                 <w:sz w:val="18"/>
                 <w:szCs w:val="18"/>
               </w:rPr>
-              <w:t xml:space="preserve">Parcel never arrives after the buyer confirmed</w:t>
+              <w:t xml:space="preserve">Buyer reports a correct shipment to stall payment</w:t>
             </w:r>
           </w:p>
         </w:tc>
@@ -3344,13 +3312,6 @@
             </w:tcMar>
           </w:tcPr>
           <w:p>
-            <w:r>
-              <w:rPr>
-                <w:sz w:val="18"/>
-                <w:szCs w:val="18"/>
-              </w:rPr>
-              <w:t xml:space="preserve">Once paid under </w:t>
-            </w:r>
             <w:r>
               <w:rPr>
                 <w:rFonts w:ascii="Leelawadee UI" w:hAnsi="Leelawadee UI" w:cs="Leelawadee UI" w:eastAsia="Leelawadee UI"/>
@@ -3374,14 +3335,14 @@
                 <w:szCs w:val="20"/>
                 <w:lang w:val="th-TH" w:bidi="th-TH"/>
               </w:rPr>
-              <w:t xml:space="preserve">๒๐</w:t>
-            </w:r>
-            <w:r>
-              <w:rPr>
-                <w:sz w:val="18"/>
-                <w:szCs w:val="18"/>
-              </w:rPr>
-              <w:t xml:space="preserve"> the money is the seller's; getting it back is a claim or criminal case against the seller</w:t>
+              <w:t xml:space="preserve">๒๓</w:t>
+            </w:r>
+            <w:r>
+              <w:rPr>
+                <w:sz w:val="18"/>
+                <w:szCs w:val="18"/>
+              </w:rPr>
+              <w:t xml:space="preserve">: no agreement means the money stays frozen</w:t>
             </w:r>
           </w:p>
         </w:tc>
@@ -3407,7 +3368,7 @@
                 <w:sz w:val="18"/>
                 <w:szCs w:val="18"/>
               </w:rPr>
-              <w:t xml:space="preserve">The buyer sees only carrier-verified data, and the confirm screen says the money goes to the seller now. Reports after payment go to the fraud team, which can have the seller's account suspended under the tech-crime decree. Recovery is not guaranteed</w:t>
+              <w:t xml:space="preserve">A reason and a photo are required, and report history counts in the buyer check. An honest seller can still be held up until settlement or a ruling</w:t>
             </w:r>
           </w:p>
         </w:tc>
@@ -3439,7 +3400,7 @@
                 <w:sz w:val="18"/>
                 <w:szCs w:val="18"/>
               </w:rPr>
-              <w:t xml:space="preserve">The in-app contract is challenged as unfair</w:t>
+              <w:t xml:space="preserve">Buyer confirms without checking, and the parcel never arrives</w:t>
             </w:r>
           </w:p>
         </w:tc>
@@ -3465,7 +3426,7 @@
                 <w:sz w:val="18"/>
                 <w:szCs w:val="18"/>
               </w:rPr>
-              <w:t xml:space="preserve">The contract is a </w:t>
+              <w:t xml:space="preserve">Once paid under </w:t>
             </w:r>
             <w:r>
               <w:rPr>
@@ -3474,14 +3435,14 @@
                 <w:szCs w:val="20"/>
                 <w:lang w:val="th-TH" w:bidi="th-TH"/>
               </w:rPr>
-              <w:t xml:space="preserve">สัญญาสำเร็จรูป</w:t>
-            </w:r>
-            <w:r>
-              <w:rPr>
-                <w:sz w:val="18"/>
-                <w:szCs w:val="18"/>
-              </w:rPr>
-              <w:t xml:space="preserve"> (standard form). Under the Unfair Contract Terms Act B.E. 2540 </w:t>
+              <w:t xml:space="preserve">ม</w:t>
+            </w:r>
+            <w:r>
+              <w:rPr>
+                <w:sz w:val="18"/>
+                <w:szCs w:val="18"/>
+              </w:rPr>
+              <w:t xml:space="preserve">.</w:t>
             </w:r>
             <w:r>
               <w:rPr>
@@ -3490,30 +3451,14 @@
                 <w:szCs w:val="20"/>
                 <w:lang w:val="th-TH" w:bidi="th-TH"/>
               </w:rPr>
-              <w:t xml:space="preserve">ม</w:t>
-            </w:r>
-            <w:r>
-              <w:rPr>
-                <w:sz w:val="18"/>
-                <w:szCs w:val="18"/>
-              </w:rPr>
-              <w:t xml:space="preserve">.</w:t>
-            </w:r>
-            <w:r>
-              <w:rPr>
-                <w:rFonts w:ascii="Leelawadee UI" w:hAnsi="Leelawadee UI" w:cs="Leelawadee UI" w:eastAsia="Leelawadee UI"/>
-                <w:sz w:val="20"/>
-                <w:szCs w:val="20"/>
-                <w:lang w:val="th-TH" w:bidi="th-TH"/>
-              </w:rPr>
-              <w:t xml:space="preserve">๔</w:t>
-            </w:r>
-            <w:r>
-              <w:rPr>
-                <w:sz w:val="18"/>
-                <w:szCs w:val="18"/>
-              </w:rPr>
-              <w:t xml:space="preserve">, a term giving the drafter an unreasonable advantage is enforced only as far as is fair</w:t>
+              <w:t xml:space="preserve">๒๐</w:t>
+            </w:r>
+            <w:r>
+              <w:rPr>
+                <w:sz w:val="18"/>
+                <w:szCs w:val="18"/>
+              </w:rPr>
+              <w:t xml:space="preserve"> the money is the seller's; getting it back is a claim or criminal case against the seller</w:t>
             </w:r>
           </w:p>
         </w:tc>
@@ -3539,7 +3484,7 @@
                 <w:sz w:val="18"/>
                 <w:szCs w:val="18"/>
               </w:rPr>
-              <w:t xml:space="preserve">Same objective rules for every deal. The seller is told at once when an ID fails. No clause excuses the bank from its own verification errors</w:t>
+              <w:t xml:space="preserve">The confirm screen shows the contract's address and recipient beside the shipment ID and says the money goes to the seller now. Reports after payment go to the fraud team. Recovery is not guaranteed</w:t>
             </w:r>
           </w:p>
         </w:tc>
@@ -3571,7 +3516,7 @@
                 <w:sz w:val="18"/>
                 <w:szCs w:val="18"/>
               </w:rPr>
-              <w:t xml:space="preserve">Refund paid by mistake: the seller really shipped but carrier data failed</w:t>
+              <w:t xml:space="preserve">The in-app contract is challenged as unfair</w:t>
             </w:r>
           </w:p>
         </w:tc>
@@ -3597,7 +3542,7 @@
                 <w:sz w:val="18"/>
                 <w:szCs w:val="18"/>
               </w:rPr>
-              <w:t xml:space="preserve">Civil and Commercial Code </w:t>
+              <w:t xml:space="preserve">The contract is a </w:t>
             </w:r>
             <w:r>
               <w:rPr>
@@ -3606,14 +3551,14 @@
                 <w:szCs w:val="20"/>
                 <w:lang w:val="th-TH" w:bidi="th-TH"/>
               </w:rPr>
-              <w:t xml:space="preserve">ม</w:t>
-            </w:r>
-            <w:r>
-              <w:rPr>
-                <w:sz w:val="18"/>
-                <w:szCs w:val="18"/>
-              </w:rPr>
-              <w:t xml:space="preserve">.</w:t>
+              <w:t xml:space="preserve">สัญญาสำเร็จรูป</w:t>
+            </w:r>
+            <w:r>
+              <w:rPr>
+                <w:sz w:val="18"/>
+                <w:szCs w:val="18"/>
+              </w:rPr>
+              <w:t xml:space="preserve"> (standard form). Under the Unfair Contract Terms Act B.E. 2540 </w:t>
             </w:r>
             <w:r>
               <w:rPr>
@@ -3622,14 +3567,30 @@
                 <w:szCs w:val="20"/>
                 <w:lang w:val="th-TH" w:bidi="th-TH"/>
               </w:rPr>
-              <w:t xml:space="preserve">๔๐๖</w:t>
-            </w:r>
-            <w:r>
-              <w:rPr>
-                <w:sz w:val="18"/>
-                <w:szCs w:val="18"/>
-              </w:rPr>
-              <w:t xml:space="preserve">: whoever receives something without legal ground must return it</w:t>
+              <w:t xml:space="preserve">ม</w:t>
+            </w:r>
+            <w:r>
+              <w:rPr>
+                <w:sz w:val="18"/>
+                <w:szCs w:val="18"/>
+              </w:rPr>
+              <w:t xml:space="preserve">.</w:t>
+            </w:r>
+            <w:r>
+              <w:rPr>
+                <w:rFonts w:ascii="Leelawadee UI" w:hAnsi="Leelawadee UI" w:cs="Leelawadee UI" w:eastAsia="Leelawadee UI"/>
+                <w:sz w:val="20"/>
+                <w:szCs w:val="20"/>
+                <w:lang w:val="th-TH" w:bidi="th-TH"/>
+              </w:rPr>
+              <w:t xml:space="preserve">๔</w:t>
+            </w:r>
+            <w:r>
+              <w:rPr>
+                <w:sz w:val="18"/>
+                <w:szCs w:val="18"/>
+              </w:rPr>
+              <w:t xml:space="preserve">, a term giving the drafter an unreasonable advantage is enforced only as far as is fair</w:t>
             </w:r>
           </w:p>
         </w:tc>
@@ -3655,7 +3616,7 @@
                 <w:sz w:val="18"/>
                 <w:szCs w:val="18"/>
               </w:rPr>
-              <w:t xml:space="preserve">The seller can claim the money back from the buyer. The audit log proves the bank followed the contract</w:t>
+              <w:t xml:space="preserve">Same rules for every deal and both sides. The bank makes no judgement on disputes and cannot release a disputed deal on its own</w:t>
             </w:r>
           </w:p>
         </w:tc>
@@ -3687,7 +3648,7 @@
                 <w:sz w:val="18"/>
                 <w:szCs w:val="18"/>
               </w:rPr>
-              <w:t xml:space="preserve">A “refund” used to move money to a third party</w:t>
+              <w:t xml:space="preserve">Refund after expiry, but the seller had shipped and forgot to enter the ID</w:t>
             </w:r>
           </w:p>
         </w:tc>
@@ -3708,6 +3669,13 @@
             </w:tcMar>
           </w:tcPr>
           <w:p>
+            <w:r>
+              <w:rPr>
+                <w:sz w:val="18"/>
+                <w:szCs w:val="18"/>
+              </w:rPr>
+              <w:t xml:space="preserve">Civil and Commercial Code </w:t>
+            </w:r>
             <w:r>
               <w:rPr>
                 <w:rFonts w:ascii="Leelawadee UI" w:hAnsi="Leelawadee UI" w:cs="Leelawadee UI" w:eastAsia="Leelawadee UI"/>
@@ -3731,6 +3699,115 @@
                 <w:szCs w:val="20"/>
                 <w:lang w:val="th-TH" w:bidi="th-TH"/>
               </w:rPr>
+              <w:t xml:space="preserve">๔๐๖</w:t>
+            </w:r>
+            <w:r>
+              <w:rPr>
+                <w:sz w:val="18"/>
+                <w:szCs w:val="18"/>
+              </w:rPr>
+              <w:t xml:space="preserve">: whoever receives something without legal ground must return it</w:t>
+            </w:r>
+          </w:p>
+        </w:tc>
+        <w:tc>
+          <w:tcPr>
+            <w:tcW w:type="dxa" w:w="3806"/>
+            <w:tcBorders>
+              <w:top w:val="single" w:color="BBBBBB" w:sz="4"/>
+              <w:left w:val="single" w:color="BBBBBB" w:sz="4"/>
+              <w:bottom w:val="single" w:color="BBBBBB" w:sz="4"/>
+              <w:right w:val="single" w:color="BBBBBB" w:sz="4"/>
+            </w:tcBorders>
+            <w:tcMar>
+              <w:top w:type="dxa" w:w="60"/>
+              <w:left w:type="dxa" w:w="90"/>
+              <w:bottom w:type="dxa" w:w="60"/>
+              <w:right w:type="dxa" w:w="90"/>
+            </w:tcMar>
+          </w:tcPr>
+          <w:p>
+            <w:r>
+              <w:rPr>
+                <w:sz w:val="18"/>
+                <w:szCs w:val="18"/>
+              </w:rPr>
+              <w:t xml:space="preserve">The seller can claim the money back from the buyer. The audit log proves the bank followed the contract</w:t>
+            </w:r>
+          </w:p>
+        </w:tc>
+      </w:tr>
+      <w:tr>
+        <w:trPr>
+          <w:cantSplit/>
+          <w:tblHeader w:val="false"/>
+        </w:trPr>
+        <w:tc>
+          <w:tcPr>
+            <w:tcW w:type="dxa" w:w="2300"/>
+            <w:tcBorders>
+              <w:top w:val="single" w:color="BBBBBB" w:sz="4"/>
+              <w:left w:val="single" w:color="BBBBBB" w:sz="4"/>
+              <w:bottom w:val="single" w:color="BBBBBB" w:sz="4"/>
+              <w:right w:val="single" w:color="BBBBBB" w:sz="4"/>
+            </w:tcBorders>
+            <w:tcMar>
+              <w:top w:type="dxa" w:w="60"/>
+              <w:left w:type="dxa" w:w="90"/>
+              <w:bottom w:type="dxa" w:w="60"/>
+              <w:right w:type="dxa" w:w="90"/>
+            </w:tcMar>
+          </w:tcPr>
+          <w:p>
+            <w:r>
+              <w:rPr>
+                <w:sz w:val="18"/>
+                <w:szCs w:val="18"/>
+              </w:rPr>
+              <w:t xml:space="preserve">A “refund” or settlement used to move money to a third party</w:t>
+            </w:r>
+          </w:p>
+        </w:tc>
+        <w:tc>
+          <w:tcPr>
+            <w:tcW w:type="dxa" w:w="3800"/>
+            <w:tcBorders>
+              <w:top w:val="single" w:color="BBBBBB" w:sz="4"/>
+              <w:left w:val="single" w:color="BBBBBB" w:sz="4"/>
+              <w:bottom w:val="single" w:color="BBBBBB" w:sz="4"/>
+              <w:right w:val="single" w:color="BBBBBB" w:sz="4"/>
+            </w:tcBorders>
+            <w:tcMar>
+              <w:top w:type="dxa" w:w="60"/>
+              <w:left w:type="dxa" w:w="90"/>
+              <w:bottom w:type="dxa" w:w="60"/>
+              <w:right w:type="dxa" w:w="90"/>
+            </w:tcMar>
+          </w:tcPr>
+          <w:p>
+            <w:r>
+              <w:rPr>
+                <w:rFonts w:ascii="Leelawadee UI" w:hAnsi="Leelawadee UI" w:cs="Leelawadee UI" w:eastAsia="Leelawadee UI"/>
+                <w:sz w:val="20"/>
+                <w:szCs w:val="20"/>
+                <w:lang w:val="th-TH" w:bidi="th-TH"/>
+              </w:rPr>
+              <w:t xml:space="preserve">ม</w:t>
+            </w:r>
+            <w:r>
+              <w:rPr>
+                <w:sz w:val="18"/>
+                <w:szCs w:val="18"/>
+              </w:rPr>
+              <w:t xml:space="preserve">.</w:t>
+            </w:r>
+            <w:r>
+              <w:rPr>
+                <w:rFonts w:ascii="Leelawadee UI" w:hAnsi="Leelawadee UI" w:cs="Leelawadee UI" w:eastAsia="Leelawadee UI"/>
+                <w:sz w:val="20"/>
+                <w:szCs w:val="20"/>
+                <w:lang w:val="th-TH" w:bidi="th-TH"/>
+              </w:rPr>
               <w:t xml:space="preserve">๒๐</w:t>
             </w:r>
             <w:r>
@@ -3764,7 +3841,7 @@
                 <w:sz w:val="18"/>
                 <w:szCs w:val="18"/>
               </w:rPr>
-              <w:t xml:space="preserve">Refunds go only to the account that paid</w:t>
+              <w:t xml:space="preserve">Refunds and settlements go only to the account that paid</w:t>
             </w:r>
           </w:p>
         </w:tc>
@@ -3775,7 +3852,7 @@
         <w:spacing w:before="100" w:after="100"/>
       </w:pPr>
       <w:r>
-        <w:t xml:space="preserve">The 72-hour and 48-hour periods are proposals. Paying the seller at the buyer's confirmation, not at delivery, is a team decision: honest sellers are paid sooner, but a parcel that never arrives after confirmation is no longer protected by escrow.</w:t>
+        <w:t xml:space="preserve">The 72-hour and 48-hour periods are proposals. Paying the seller at the buyer's confirmation, not at delivery, is a team decision: honest sellers are paid sooner, but a parcel that never arrives after confirmation is no longer protected by escrow. The bank does not verify tracking numbers, to keep third-party integrations to a minimum; the buyer's own check is the safeguard.</w:t>
       </w:r>
     </w:p>
     <w:p>
@@ -3931,7 +4008,7 @@
         <w:t xml:space="preserve">BOT permission for extra services.</w:t>
       </w:r>
       <w:r>
-        <w:t xml:space="preserve"> Shipment-tracking verification may count as an “other service” under </w:t>
+        <w:t xml:space="preserve"> EsKrow+ no longer verifies tracking numbers, but the risk check and the Evidence Pack may still count as “other services” under </w:t>
       </w:r>
       <w:r>
         <w:rPr>
@@ -3955,7 +4032,7 @@
         <w:t xml:space="preserve">๗ วรรคสอง</w:t>
       </w:r>
       <w:r>
-        <w:t xml:space="preserve">, which needs BOT permission before use (5.2.1(2)).</w:t>
+        <w:t xml:space="preserve">, which need BOT permission before use (5.2.1(2)).</w:t>
       </w:r>
     </w:p>
     <w:p>
@@ -4319,7 +4396,7 @@
                 <w:sz w:val="18"/>
                 <w:szCs w:val="18"/>
               </w:rPr>
-              <w:t xml:space="preserve">Tracking numbers, delivery addresses, device and behaviour signals are personal data. Needs a lawful basis, a privacy notice, and data-sharing terms with couriers.</w:t>
+              <w:t xml:space="preserve">Tracking numbers, delivery addresses, device and behaviour signals are personal data. Needs a lawful basis and a privacy notice, plus a legal basis for sending Evidence Packs to AOC 1441 / police. The buyer check result is never shown to the seller. No data goes to couriers.</w:t>
             </w:r>
           </w:p>
         </w:tc>
@@ -4521,7 +4598,7 @@
         <w:spacing w:after="60"/>
       </w:pPr>
       <w:r>
-        <w:t xml:space="preserve">Is shipment verification an “other service” under </w:t>
+        <w:t xml:space="preserve">Do the risk check and the Evidence Pack count as an “other service” under </w:t>
       </w:r>
       <w:r>
         <w:rPr>
@@ -4558,7 +4635,7 @@
         <w:spacing w:after="60"/>
       </w:pPr>
       <w:r>
-        <w:t xml:space="preserve">Are the proposed release and refund rules fair under the Unfair Contract Terms Act, and are 72 and 48 hours the right periods?</w:t>
+        <w:t xml:space="preserve">Are the proposed release and refund rules fair under the Unfair Contract Terms Act, and are 72 hours to ship and 48 hours to confirm the right periods?</w:t>
       </w:r>
     </w:p>
     <w:p>
@@ -4571,7 +4648,7 @@
         <w:spacing w:after="60"/>
       </w:pPr>
       <w:r>
-        <w:t xml:space="preserve">If police, AMLO or the anti-tech-crime centre freezes a party's money, how does that order apply to funds already in escrow?</w:t>
+        <w:t xml:space="preserve">How long may a reported deal stay held before the Evidence Pack goes out, and what happens to the money if no authority order or court case follows?</w:t>
       </w:r>
     </w:p>
     <w:p>
@@ -4584,31 +4661,7 @@
         <w:spacing w:after="60"/>
       </w:pPr>
       <w:r>
-        <w:t xml:space="preserve">Does KBank count as having an interest (</w:t>
-      </w:r>
-      <w:r>
-        <w:rPr>
-          <w:rFonts w:ascii="Leelawadee UI" w:hAnsi="Leelawadee UI" w:cs="Leelawadee UI" w:eastAsia="Leelawadee UI"/>
-          <w:sz w:val="22"/>
-          <w:szCs w:val="22"/>
-          <w:lang w:val="th-TH" w:bidi="th-TH"/>
-        </w:rPr>
-        <w:t xml:space="preserve">ม</w:t>
-      </w:r>
-      <w:r>
-        <w:t xml:space="preserve">.</w:t>
-      </w:r>
-      <w:r>
-        <w:rPr>
-          <w:rFonts w:ascii="Leelawadee UI" w:hAnsi="Leelawadee UI" w:cs="Leelawadee UI" w:eastAsia="Leelawadee UI"/>
-          <w:sz w:val="22"/>
-          <w:szCs w:val="22"/>
-          <w:lang w:val="th-TH" w:bidi="th-TH"/>
-        </w:rPr>
-        <w:t xml:space="preserve">๑๒</w:t>
-      </w:r>
-      <w:r>
-        <w:t xml:space="preserve">) when the seller is also a KBank customer?</w:t>
+        <w:t xml:space="preserve">If police, AMLO or the anti-tech-crime centre freezes a party's money, how does that order apply to funds already in escrow?</w:t>
       </w:r>
     </w:p>
     <w:p>
@@ -4621,7 +4674,7 @@
         <w:spacing w:after="60"/>
       </w:pPr>
       <w:r>
-        <w:t xml:space="preserve">Has the Escrow Committee capped fees under </w:t>
+        <w:t xml:space="preserve">Does KBank count as having an interest (</w:t>
       </w:r>
       <w:r>
         <w:rPr>
@@ -4642,10 +4695,10 @@
           <w:szCs w:val="22"/>
           <w:lang w:val="th-TH" w:bidi="th-TH"/>
         </w:rPr>
-        <w:t xml:space="preserve">๘</w:t>
-      </w:r>
-      <w:r>
-        <w:t xml:space="preserve">, and how must fees be disclosed?</w:t>
+        <w:t xml:space="preserve">๑๒</w:t>
+      </w:r>
+      <w:r>
+        <w:t xml:space="preserve">) when the seller is also a KBank customer?</w:t>
       </w:r>
     </w:p>
     <w:p>
@@ -4658,7 +4711,44 @@
         <w:spacing w:after="60"/>
       </w:pPr>
       <w:r>
-        <w:t xml:space="preserve">Can sellers who bank elsewhere, paid out via PromptPay, be parties, and what KYC applies to them?</w:t>
+        <w:t xml:space="preserve">Has the Escrow Committee capped fees under </w:t>
+      </w:r>
+      <w:r>
+        <w:rPr>
+          <w:rFonts w:ascii="Leelawadee UI" w:hAnsi="Leelawadee UI" w:cs="Leelawadee UI" w:eastAsia="Leelawadee UI"/>
+          <w:sz w:val="22"/>
+          <w:szCs w:val="22"/>
+          <w:lang w:val="th-TH" w:bidi="th-TH"/>
+        </w:rPr>
+        <w:t xml:space="preserve">ม</w:t>
+      </w:r>
+      <w:r>
+        <w:t xml:space="preserve">.</w:t>
+      </w:r>
+      <w:r>
+        <w:rPr>
+          <w:rFonts w:ascii="Leelawadee UI" w:hAnsi="Leelawadee UI" w:cs="Leelawadee UI" w:eastAsia="Leelawadee UI"/>
+          <w:sz w:val="22"/>
+          <w:szCs w:val="22"/>
+          <w:lang w:val="th-TH" w:bidi="th-TH"/>
+        </w:rPr>
+        <w:t xml:space="preserve">๘</w:t>
+      </w:r>
+      <w:r>
+        <w:t xml:space="preserve">, and how must fees be disclosed?</w:t>
+      </w:r>
+    </w:p>
+    <w:p>
+      <w:pPr>
+        <w:pStyle w:val="ListParagraph"/>
+        <w:numPr>
+          <w:ilvl w:val="0"/>
+          <w:numId w:val="4"/>
+        </w:numPr>
+        <w:spacing w:after="60"/>
+      </w:pPr>
+      <w:r>
+        <w:t xml:space="preserve">Phase 1 is KBank customers only. For phase 2, can sellers who bank elsewhere, paid out via PromptPay, be parties, and what KYC applies to them?</w:t>
       </w:r>
     </w:p>
     <w:p>
@@ -4678,7 +4768,7 @@
         </w:numPr>
         <w:spacing w:after="60"/>
       </w:pPr>
-      <w:hyperlink w:history="1" r:id="rId0hvgwfjj0eshk6d6fyfyx">
+      <w:hyperlink w:history="1" r:id="rIdzc-dckjjmtsfyjcq7hiik">
         <w:r>
           <w:rPr>
             <w:rStyle w:val="Hyperlink"/>
@@ -4738,7 +4828,7 @@
         </w:numPr>
         <w:spacing w:after="60"/>
       </w:pPr>
-      <w:hyperlink w:history="1" r:id="rIdpac9se2goixyd5wlcsgiy">
+      <w:hyperlink w:history="1" r:id="rIdxwdpimr5p-wr3nbm5b9zp">
         <w:r>
           <w:rPr>
             <w:rStyle w:val="Hyperlink"/>
@@ -4756,7 +4846,7 @@
         </w:numPr>
         <w:spacing w:after="60"/>
       </w:pPr>
-      <w:hyperlink w:history="1" r:id="rId0f9v6ow2cucvf0jff9sho">
+      <w:hyperlink w:history="1" r:id="rId-wp_lilrxxb8kmbqqsnoz">
         <w:r>
           <w:rPr>
             <w:rStyle w:val="Hyperlink"/>
@@ -4774,7 +4864,7 @@
         </w:numPr>
         <w:spacing w:after="60"/>
       </w:pPr>
-      <w:hyperlink w:history="1" r:id="rIdl6qm3m7zda5giyzt5ayqg">
+      <w:hyperlink w:history="1" r:id="rIdwlzv2ptce5qk49rcwyvlo">
         <w:r>
           <w:rPr>
             <w:rStyle w:val="Hyperlink"/>
@@ -4792,7 +4882,7 @@
         </w:numPr>
         <w:spacing w:after="60"/>
       </w:pPr>
-      <w:hyperlink w:history="1" r:id="rId0wbmdxneousom-ce6wmij">
+      <w:hyperlink w:history="1" r:id="rIdk1nfhwbb2bevi1lkj3zzk">
         <w:r>
           <w:rPr>
             <w:rStyle w:val="Hyperlink"/>
@@ -4810,7 +4900,7 @@
         </w:numPr>
         <w:spacing w:after="60"/>
       </w:pPr>
-      <w:hyperlink w:history="1" r:id="rIdwp0b2bwxcjb7o-pb7lwfk">
+      <w:hyperlink w:history="1" r:id="rId0a5mahvzmbdo9qve1ooen">
         <w:r>
           <w:rPr>
             <w:rStyle w:val="Hyperlink"/>
@@ -4870,7 +4960,7 @@
         </w:numPr>
         <w:spacing w:after="60"/>
       </w:pPr>
-      <w:hyperlink w:history="1" r:id="rIdf7ersw638ecfmwe7_fb1s">
+      <w:hyperlink w:history="1" r:id="rIdur_pmwnivq7onmmcpjwga">
         <w:r>
           <w:rPr>
             <w:rStyle w:val="Hyperlink"/>
@@ -5145,33 +5235,18 @@
   </w:abstractNum>
   <w:num w:numId="1">
     <w:abstractNumId w:val="1"/>
-    <w:lvlOverride w:ilvl="0">
-      <w:startOverride w:val="1"/>
-    </w:lvlOverride>
   </w:num>
   <w:num w:numId="2">
     <w:abstractNumId w:val="4"/>
-    <w:lvlOverride w:ilvl="0">
-      <w:startOverride w:val="1"/>
-    </w:lvlOverride>
   </w:num>
   <w:num w:numId="3">
     <w:abstractNumId w:val="5"/>
-    <w:lvlOverride w:ilvl="0">
-      <w:startOverride w:val="1"/>
-    </w:lvlOverride>
   </w:num>
   <w:num w:numId="4">
     <w:abstractNumId w:val="3"/>
-    <w:lvlOverride w:ilvl="0">
-      <w:startOverride w:val="1"/>
-    </w:lvlOverride>
   </w:num>
   <w:num w:numId="5">
     <w:abstractNumId w:val="2"/>
-    <w:lvlOverride w:ilvl="0">
-      <w:startOverride w:val="1"/>
-    </w:lvlOverride>
   </w:num>
 </w:numbering>
 </file>

</xml_diff>

<commit_message>
Make escrow universal and neutralize risk UX
Update the demo and supporting documentation so every deal uses escrow, with 48-hour shipping and 24-hour confirmation windows. Replace high-risk verdicts with neutral account facts, add account-status gating, require live face scans for both parties, and document seller reputation stats and payout safeguards.
</commit_message>
<xml_diff>
--- a/EsKrow+_Legal_Feasibility.docx
+++ b/EsKrow+_Legal_Feasibility.docx
@@ -97,7 +97,7 @@
         <w:spacing w:after="100"/>
       </w:pPr>
       <w:r>
-        <w:t xml:space="preserve">KBank still needs Ministry of Finance permission and must notify the BOT before launch. Every deal that goes through escrow (rated yellow or red; green deals are paid directly) needs an escrow contract signed by both sides and the bank.</w:t>
+        <w:t xml:space="preserve">KBank still needs Ministry of Finance permission and must notify the BOT before launch. Every deal goes through escrow and needs an escrow contract signed by both sides and the bank.</w:t>
       </w:r>
     </w:p>
     <w:p>
@@ -1052,7 +1052,7 @@
                 <w:sz w:val="18"/>
                 <w:szCs w:val="18"/>
               </w:rPr>
-              <w:t xml:space="preserve">Seller creates the deal (item, price, buyer, shipping address); both accept, the buyer by face scan or PIN</w:t>
+              <w:t xml:space="preserve">Seller creates the deal (item, price, buyer, shipping address); both accept, each by a live face scan</w:t>
             </w:r>
           </w:p>
         </w:tc>
@@ -2478,7 +2478,7 @@
         <w:spacing w:after="100"/>
       </w:pPr>
       <w:r>
-        <w:t xml:space="preserve">The buyer releases the money after checking the shipment herself; the bank does not verify tracking numbers. Only deals rated yellow or red go through escrow, while green deals are paid to the seller directly. Every outcome follows a rule both sides signed (</w:t>
+        <w:t xml:space="preserve">The buyer releases the money after checking the shipment herself; the bank does not verify tracking numbers. Every deal goes through escrow, whatever the risk check finds. Every outcome follows a rule both sides signed (</w:t>
       </w:r>
       <w:r>
         <w:rPr>
@@ -2551,7 +2551,7 @@
         <w:spacing w:after="60"/>
       </w:pPr>
       <w:r>
-        <w:t xml:space="preserve">Within 72 hours of payment, the seller ships the goods and enters the carrier's shipment ID in K PLUS. The bank passes it to the buyer as entered and does not check it with the carrier.</w:t>
+        <w:t xml:space="preserve">Within 48 hours of payment, the seller ships the goods and enters the carrier's shipment ID in K PLUS. The bank passes it to the buyer as entered and does not check it with the carrier.</w:t>
       </w:r>
     </w:p>
     <w:p>
@@ -2577,7 +2577,7 @@
         <w:spacing w:after="60"/>
       </w:pPr>
       <w:r>
-        <w:t xml:space="preserve">If the buyer neither confirms nor reports within 48 hours of receiving the ID, the money is paid to the seller.</w:t>
+        <w:t xml:space="preserve">If the buyer neither confirms nor reports within 24 hours of receiving the ID, the money is paid to the seller.</w:t>
       </w:r>
     </w:p>
     <w:p>
@@ -2590,7 +2590,7 @@
         <w:spacing w:after="60"/>
       </w:pPr>
       <w:r>
-        <w:t xml:space="preserve">If no shipment ID arrives within 72 hours, the contract expires and the money is refunded to the buyer's paying account.</w:t>
+        <w:t xml:space="preserve">If no shipment ID arrives within 48 hours, the contract expires and the money is refunded to the buyer's paying account.</w:t>
       </w:r>
     </w:p>
     <w:p>
@@ -2732,7 +2732,7 @@
         <w:t xml:space="preserve">Release.</w:t>
       </w:r>
       <w:r>
-        <w:t xml:space="preserve"> The escrow money is paid to the seller when the buyer confirms the shipment in the app, or 48 hours after the seller's shipment ID is sent to the buyer if the buyer neither confirms nor reports a problem.</w:t>
+        <w:t xml:space="preserve"> The escrow money is paid to the seller when the buyer confirms the shipment in the app, or 24 hours after the seller's shipment ID is sent to the buyer if the buyer neither confirms nor reports a problem.</w:t>
       </w:r>
     </w:p>
     <w:p>
@@ -2752,7 +2752,7 @@
         <w:t xml:space="preserve">Expiry and refund.</w:t>
       </w:r>
       <w:r>
-        <w:t xml:space="preserve"> If the seller does not enter a shipment ID within 72 hours of payment, this contract expires and the escrow money is returned to the buyer's paying account.</w:t>
+        <w:t xml:space="preserve"> If the seller does not enter a shipment ID within 48 hours of payment, this contract expires and the escrow money is returned to the buyer's paying account.</w:t>
       </w:r>
     </w:p>
     <w:p>
@@ -3009,7 +3009,7 @@
                 <w:sz w:val="18"/>
                 <w:szCs w:val="18"/>
               </w:rPr>
-              <w:t xml:space="preserve">Only a shipment ID entered within 72 hours counts. No ID means the contract expires and the buyer is refunded</w:t>
+              <w:t xml:space="preserve">Only a shipment ID entered within 48 hours counts. No ID means the contract expires and the buyer is refunded</w:t>
             </w:r>
           </w:p>
         </w:tc>
@@ -3259,7 +3259,7 @@
                 <w:sz w:val="18"/>
                 <w:szCs w:val="18"/>
               </w:rPr>
-              <w:t xml:space="preserve">Paid to the seller 48 hours after the shipment ID is sent</w:t>
+              <w:t xml:space="preserve">Paid to the seller 24 hours after the shipment ID is sent</w:t>
             </w:r>
           </w:p>
         </w:tc>
@@ -3852,7 +3852,7 @@
         <w:spacing w:before="100" w:after="100"/>
       </w:pPr>
       <w:r>
-        <w:t xml:space="preserve">The 72-hour and 48-hour periods are proposals. Paying the seller at the buyer's confirmation, not at delivery, is a team decision: honest sellers are paid sooner, but a parcel that never arrives after confirmation is no longer protected by escrow. The bank does not verify tracking numbers, to keep third-party integrations to a minimum; the buyer's own check is the safeguard.</w:t>
+        <w:t xml:space="preserve">The 48-hour and 24-hour periods are proposals. Paying the seller at the buyer's confirmation, not at delivery, is a team decision: honest sellers are paid sooner, but a parcel that never arrives after confirmation is no longer protected by escrow. The bank does not verify tracking numbers, to keep third-party integrations to a minimum; the buyer's own check is the safeguard.</w:t>
       </w:r>
     </w:p>
     <w:p>
@@ -4396,7 +4396,71 @@
                 <w:sz w:val="18"/>
                 <w:szCs w:val="18"/>
               </w:rPr>
-              <w:t xml:space="preserve">Tracking numbers, delivery addresses, device and behaviour signals are personal data. Needs a lawful basis and a privacy notice, plus a legal basis for sending Evidence Packs to AOC 1441 / police. The buyer check result is never shown to the seller. No data goes to couriers.</w:t>
+              <w:t xml:space="preserve">Tracking numbers, delivery addresses, device and behaviour signals are personal data. Needs a lawful basis and a privacy notice, plus a legal basis for sending Evidence Packs to AOC 1441 / police. The buyer check result is never shown to the seller. The risk check queries the police criminal-record database; criminal records are sensitive data under </w:t>
+            </w:r>
+            <w:r>
+              <w:rPr>
+                <w:rFonts w:ascii="Leelawadee UI" w:hAnsi="Leelawadee UI" w:cs="Leelawadee UI" w:eastAsia="Leelawadee UI"/>
+                <w:sz w:val="20"/>
+                <w:szCs w:val="20"/>
+                <w:lang w:val="th-TH" w:bidi="th-TH"/>
+              </w:rPr>
+              <w:t xml:space="preserve">ม</w:t>
+            </w:r>
+            <w:r>
+              <w:rPr>
+                <w:sz w:val="18"/>
+                <w:szCs w:val="18"/>
+              </w:rPr>
+              <w:t xml:space="preserve">.</w:t>
+            </w:r>
+            <w:r>
+              <w:rPr>
+                <w:rFonts w:ascii="Leelawadee UI" w:hAnsi="Leelawadee UI" w:cs="Leelawadee UI" w:eastAsia="Leelawadee UI"/>
+                <w:sz w:val="20"/>
+                <w:szCs w:val="20"/>
+                <w:lang w:val="th-TH" w:bidi="th-TH"/>
+              </w:rPr>
+              <w:t xml:space="preserve">๒๖</w:t>
+            </w:r>
+            <w:r>
+              <w:rPr>
+                <w:sz w:val="18"/>
+                <w:szCs w:val="18"/>
+              </w:rPr>
+              <w:t xml:space="preserve">, so it needs a specific legal basis and the result itself must never be shown to the buyer. Live face scans are biometric data under </w:t>
+            </w:r>
+            <w:r>
+              <w:rPr>
+                <w:rFonts w:ascii="Leelawadee UI" w:hAnsi="Leelawadee UI" w:cs="Leelawadee UI" w:eastAsia="Leelawadee UI"/>
+                <w:sz w:val="20"/>
+                <w:szCs w:val="20"/>
+                <w:lang w:val="th-TH" w:bidi="th-TH"/>
+              </w:rPr>
+              <w:t xml:space="preserve">ม</w:t>
+            </w:r>
+            <w:r>
+              <w:rPr>
+                <w:sz w:val="18"/>
+                <w:szCs w:val="18"/>
+              </w:rPr>
+              <w:t xml:space="preserve">.</w:t>
+            </w:r>
+            <w:r>
+              <w:rPr>
+                <w:rFonts w:ascii="Leelawadee UI" w:hAnsi="Leelawadee UI" w:cs="Leelawadee UI" w:eastAsia="Leelawadee UI"/>
+                <w:sz w:val="20"/>
+                <w:szCs w:val="20"/>
+                <w:lang w:val="th-TH" w:bidi="th-TH"/>
+              </w:rPr>
+              <w:t xml:space="preserve">๒๖</w:t>
+            </w:r>
+            <w:r>
+              <w:rPr>
+                <w:sz w:val="18"/>
+                <w:szCs w:val="18"/>
+              </w:rPr>
+              <w:t xml:space="preserve"> too. No data goes to couriers.</w:t>
             </w:r>
           </w:p>
         </w:tc>
@@ -4635,7 +4699,7 @@
         <w:spacing w:after="60"/>
       </w:pPr>
       <w:r>
-        <w:t xml:space="preserve">Are the proposed release and refund rules fair under the Unfair Contract Terms Act, and are 72 hours to ship and 48 hours to confirm the right periods?</w:t>
+        <w:t xml:space="preserve">Are the proposed release and refund rules fair under the Unfair Contract Terms Act, and are 48 hours to ship and 24 hours to confirm the right periods?</w:t>
       </w:r>
     </w:p>
     <w:p>
@@ -4648,7 +4712,7 @@
         <w:spacing w:after="60"/>
       </w:pPr>
       <w:r>
-        <w:t xml:space="preserve">How long may a reported deal stay held before the Evidence Pack goes out, and what happens to the money if no authority order or court case follows?</w:t>
+        <w:t xml:space="preserve">What legal basis lets the bank query the police criminal-record database about a seller, and what may it tell the buyer?</w:t>
       </w:r>
     </w:p>
     <w:p>
@@ -4661,7 +4725,7 @@
         <w:spacing w:after="60"/>
       </w:pPr>
       <w:r>
-        <w:t xml:space="preserve">If police, AMLO or the anti-tech-crime centre freezes a party's money, how does that order apply to funds already in escrow?</w:t>
+        <w:t xml:space="preserve">How long may a reported deal stay held before the Evidence Pack goes out, and what happens to the money if no authority order or court case follows?</w:t>
       </w:r>
     </w:p>
     <w:p>
@@ -4674,31 +4738,7 @@
         <w:spacing w:after="60"/>
       </w:pPr>
       <w:r>
-        <w:t xml:space="preserve">Does KBank count as having an interest (</w:t>
-      </w:r>
-      <w:r>
-        <w:rPr>
-          <w:rFonts w:ascii="Leelawadee UI" w:hAnsi="Leelawadee UI" w:cs="Leelawadee UI" w:eastAsia="Leelawadee UI"/>
-          <w:sz w:val="22"/>
-          <w:szCs w:val="22"/>
-          <w:lang w:val="th-TH" w:bidi="th-TH"/>
-        </w:rPr>
-        <w:t xml:space="preserve">ม</w:t>
-      </w:r>
-      <w:r>
-        <w:t xml:space="preserve">.</w:t>
-      </w:r>
-      <w:r>
-        <w:rPr>
-          <w:rFonts w:ascii="Leelawadee UI" w:hAnsi="Leelawadee UI" w:cs="Leelawadee UI" w:eastAsia="Leelawadee UI"/>
-          <w:sz w:val="22"/>
-          <w:szCs w:val="22"/>
-          <w:lang w:val="th-TH" w:bidi="th-TH"/>
-        </w:rPr>
-        <w:t xml:space="preserve">๑๒</w:t>
-      </w:r>
-      <w:r>
-        <w:t xml:space="preserve">) when the seller is also a KBank customer?</w:t>
+        <w:t xml:space="preserve">If police, AMLO or the anti-tech-crime centre freezes a party's money, how does that order apply to funds already in escrow?</w:t>
       </w:r>
     </w:p>
     <w:p>
@@ -4711,7 +4751,7 @@
         <w:spacing w:after="60"/>
       </w:pPr>
       <w:r>
-        <w:t xml:space="preserve">Has the Escrow Committee capped fees under </w:t>
+        <w:t xml:space="preserve">Does KBank count as having an interest (</w:t>
       </w:r>
       <w:r>
         <w:rPr>
@@ -4732,10 +4772,10 @@
           <w:szCs w:val="22"/>
           <w:lang w:val="th-TH" w:bidi="th-TH"/>
         </w:rPr>
-        <w:t xml:space="preserve">๘</w:t>
-      </w:r>
-      <w:r>
-        <w:t xml:space="preserve">, and how must fees be disclosed?</w:t>
+        <w:t xml:space="preserve">๑๒</w:t>
+      </w:r>
+      <w:r>
+        <w:t xml:space="preserve">) when the seller is also a KBank customer?</w:t>
       </w:r>
     </w:p>
     <w:p>
@@ -4748,6 +4788,43 @@
         <w:spacing w:after="60"/>
       </w:pPr>
       <w:r>
+        <w:t xml:space="preserve">Has the Escrow Committee capped fees under </w:t>
+      </w:r>
+      <w:r>
+        <w:rPr>
+          <w:rFonts w:ascii="Leelawadee UI" w:hAnsi="Leelawadee UI" w:cs="Leelawadee UI" w:eastAsia="Leelawadee UI"/>
+          <w:sz w:val="22"/>
+          <w:szCs w:val="22"/>
+          <w:lang w:val="th-TH" w:bidi="th-TH"/>
+        </w:rPr>
+        <w:t xml:space="preserve">ม</w:t>
+      </w:r>
+      <w:r>
+        <w:t xml:space="preserve">.</w:t>
+      </w:r>
+      <w:r>
+        <w:rPr>
+          <w:rFonts w:ascii="Leelawadee UI" w:hAnsi="Leelawadee UI" w:cs="Leelawadee UI" w:eastAsia="Leelawadee UI"/>
+          <w:sz w:val="22"/>
+          <w:szCs w:val="22"/>
+          <w:lang w:val="th-TH" w:bidi="th-TH"/>
+        </w:rPr>
+        <w:t xml:space="preserve">๘</w:t>
+      </w:r>
+      <w:r>
+        <w:t xml:space="preserve">, and how must fees be disclosed?</w:t>
+      </w:r>
+    </w:p>
+    <w:p>
+      <w:pPr>
+        <w:pStyle w:val="ListParagraph"/>
+        <w:numPr>
+          <w:ilvl w:val="0"/>
+          <w:numId w:val="4"/>
+        </w:numPr>
+        <w:spacing w:after="60"/>
+      </w:pPr>
+      <w:r>
         <w:t xml:space="preserve">Phase 1 is KBank customers only. For phase 2, can sellers who bank elsewhere, paid out via PromptPay, be parties, and what KYC applies to them?</w:t>
       </w:r>
     </w:p>
@@ -4768,7 +4845,7 @@
         </w:numPr>
         <w:spacing w:after="60"/>
       </w:pPr>
-      <w:hyperlink w:history="1" r:id="rIdzc-dckjjmtsfyjcq7hiik">
+      <w:hyperlink w:history="1" r:id="rId4jqarw-fa9bshp1cbymka">
         <w:r>
           <w:rPr>
             <w:rStyle w:val="Hyperlink"/>
@@ -4828,7 +4905,7 @@
         </w:numPr>
         <w:spacing w:after="60"/>
       </w:pPr>
-      <w:hyperlink w:history="1" r:id="rIdxwdpimr5p-wr3nbm5b9zp">
+      <w:hyperlink w:history="1" r:id="rIddemikvjtqe5yavqyvfjvp">
         <w:r>
           <w:rPr>
             <w:rStyle w:val="Hyperlink"/>
@@ -4846,7 +4923,7 @@
         </w:numPr>
         <w:spacing w:after="60"/>
       </w:pPr>
-      <w:hyperlink w:history="1" r:id="rId-wp_lilrxxb8kmbqqsnoz">
+      <w:hyperlink w:history="1" r:id="rIdlohtxu4hwgsqrx6nojrng">
         <w:r>
           <w:rPr>
             <w:rStyle w:val="Hyperlink"/>
@@ -4864,7 +4941,7 @@
         </w:numPr>
         <w:spacing w:after="60"/>
       </w:pPr>
-      <w:hyperlink w:history="1" r:id="rIdwlzv2ptce5qk49rcwyvlo">
+      <w:hyperlink w:history="1" r:id="rIdjbs1tihjx11nqneto44yv">
         <w:r>
           <w:rPr>
             <w:rStyle w:val="Hyperlink"/>
@@ -4882,7 +4959,7 @@
         </w:numPr>
         <w:spacing w:after="60"/>
       </w:pPr>
-      <w:hyperlink w:history="1" r:id="rIdk1nfhwbb2bevi1lkj3zzk">
+      <w:hyperlink w:history="1" r:id="rIdkdufesfmikypgwfhbltqz">
         <w:r>
           <w:rPr>
             <w:rStyle w:val="Hyperlink"/>
@@ -4900,7 +4977,7 @@
         </w:numPr>
         <w:spacing w:after="60"/>
       </w:pPr>
-      <w:hyperlink w:history="1" r:id="rId0a5mahvzmbdo9qve1ooen">
+      <w:hyperlink w:history="1" r:id="rIdg62g32bd9grmcdntmyvzp">
         <w:r>
           <w:rPr>
             <w:rStyle w:val="Hyperlink"/>
@@ -4960,7 +5037,7 @@
         </w:numPr>
         <w:spacing w:after="60"/>
       </w:pPr>
-      <w:hyperlink w:history="1" r:id="rIdur_pmwnivq7onmmcpjwga">
+      <w:hyperlink w:history="1" r:id="rIdyu65_t1-zv_dyrybbgjgc">
         <w:r>
           <w:rPr>
             <w:rStyle w:val="Hyperlink"/>

</xml_diff>